<commit_message>
Default to Ollama Cloud free-tier model, add ECMA stub, and guard overwrites.
Prefer ollama/gpt-oss:120b with cloud-first host defaults and TADS_LLM_PROVIDER, register ECMA as a Tier 2 corpus stub, and prompt before fetch/convert/scan overwrite existing outputs unless --overwrite.

Co-authored-by: Cursor <cursoragent@cursor.com>
</commit_message>
<xml_diff>
--- a/docs/time_assurance_doc_scanner_PRD.docx
+++ b/docs/time_assurance_doc_scanner_PRD.docx
@@ -3114,6 +3114,37 @@
       </w:r>
     </w:p>
     <w:p/>
+    <w:p>
+      <w:pPr>
+        <w:pStyle w:val="Heading1"/>
+      </w:pPr>
+      <w:r>
+        <w:t>Appendix A — Corpus additions</w:t>
+      </w:r>
+    </w:p>
+    <w:p>
+      <w:r>
+        <w:t>This appendix records Tier-2 corpus stubs added after the initial Phase 2 target list.</w:t>
+      </w:r>
+    </w:p>
+    <w:p>
+      <w:pPr>
+        <w:pStyle w:val="Heading2"/>
+      </w:pPr>
+      <w:r>
+        <w:t>ECMA International (Tier 2 stub)</w:t>
+      </w:r>
+    </w:p>
+    <w:p>
+      <w:r>
+        <w:t>ECMA is registered as a Tier 2 stub corpus (adapter id: ecma; aliases include ecma-international). Motivation: language and data standards such as ECMA-262 (JavaScript Date / epoch / Temporal-related material) are relevant to long-horizon time assurance. Remote fetch and deep ECMA-specific parsing are deferred; local plain-text / converted PDF-docx ingest is sufficient for the stub. Dual-published ISO/IEC editions may still be scanned with --corpus iso when preferred.</w:t>
+      </w:r>
+    </w:p>
+    <w:p>
+      <w:r>
+        <w:t>Initial Phase 2 Tier 2 list remains: ITU-T, IEEE, W3C, OASIS, NIST, ISO/IEC. ECMA is an additive stub, not a Tier 1 target.</w:t>
+      </w:r>
+    </w:p>
     <w:sectPr>
       <w:pgSz w:w="12240" w:h="15840"/>
       <w:pgMar w:top="1440" w:right="1440" w:bottom="1440" w:left="1440" w:header="720" w:footer="720" w:gutter="0"/>

</xml_diff>